<commit_message>
Explain the web three-window demo congestion control in the JIGS draft.
State that morning/midday/evening only scales arterial OSM multipliers on
the frozen 06:00 station field and is not Gap 1 or Gap 2 evidence.

Co-authored-by: Ductam6767 <Ductam6767@users.noreply.github.com>
</commit_message>
<xml_diff>
--- a/reports/AIRPATH_AI_JIGS_IEEE_Style_English_FINAL_REVISED.docx
+++ b/reports/AIRPATH_AI_JIGS_IEEE_Style_English_FINAL_REVISED.docx
@@ -1955,7 +1955,7 @@
         <w:ind w:firstLine="216"/>
       </w:pPr>
       <w:r>
-        <w:t>The web prototype is a user-facing rendering of the research pipeline rather than an independent validation instrument. It uses a frontend based on Vite, React, TypeScript, and Leaflet and a FastAPI backend. Demonstration scenarios are precomputed so the interface remains stable and reproducible. The user selects origin, destination, walking or motorbike, and maximum additional travel time. The interface displays the fastest route and up to three feasible alternatives together with travel time, extra minutes, and predicted exposure.</w:t>
+        <w:t>The web prototype is a user-facing rendering of the research pipeline rather than an independent validation instrument. It uses a frontend based on Vite, React, TypeScript, and Leaflet and a FastAPI backend. Demonstration scenarios are precomputed so the interface remains stable and reproducible. The user selects origin, destination, walking or motorbike, maximum additional travel time, and a demonstration time-of-day control with three windows: morning peak, midday, and evening peak. The interface displays the fastest route and up to three feasible alternatives together with travel time, extra minutes, and predicted exposure.</w:t>
       </w:r>
     </w:p>
     <w:p>
@@ -2003,7 +2003,7 @@
         <w:pStyle w:val="IEEECaption"/>
       </w:pPr>
       <w:r>
-        <w:t>Fig. 2. AIRPATH-AI web prototype showing route comparison for a motorbike scenario.</w:t>
+        <w:t>Fig. 2. AIRPATH-AI web prototype for a motorbike scenario, including the three-window demo congestion control.</w:t>
       </w:r>
     </w:p>
     <w:p>
@@ -2021,7 +2021,16 @@
         <w:ind w:firstLine="216"/>
       </w:pPr>
       <w:r>
-        <w:t>A representative interface case shows approximately 15.5 min and exposure 696 for the fastest route versus approximately 16.4 min and exposure 490 for one alternative. These values are demonstration outputs only. They are not panel-level experimental statistics, are not direct on-road measurements, and are not evidence for Gap 1 or Gap 2.</w:t>
+        <w:t>A representative interface case may show, for example, approximately 15.5 min and exposure 696–739 for the fastest motorbike route versus approximately 16.4 min and 490–514 for one alternative, depending on the selected demonstration window. These values are demonstration outputs only. They are not panel-level experimental statistics, are not direct on-road measurements, and are not evidence for Gap 1 or Gap 2.</w:t>
+      </w:r>
+    </w:p>
+    <w:p>
+      <w:pPr>
+        <w:pStyle w:val="IEEEBody"/>
+        <w:ind w:firstLine="216"/>
+      </w:pPr>
+      <w:r>
+        <w:t xml:space="preserve">The three-window control is labeled in the interface as “Time of day (demo congestion proxy).” It is a product illustration, not a Gap 1 or Gap 2 experiment. Travel times, candidate geometry, and the station-IDW background remain the frozen 06:00 field. Only a deterministic arterial OSM-class multiplier changes (about 1.12 at the morning window, 1.04 at midday, and 1.20 at the evening window); residential and alley ways are left unchanged. The control therefore does not measure which street is congested, does not move HealthyAir to 12:00 or 18:00, and usually does not redraw the selected polyline—as expected when the same candidates and the same selector see only a small arterial scale factor. In the packaged demo scan, the number of cases with a lower-exposure alternative is 41/80 at morning and evening peak and 40/80 at midday. Those counts must not be substituted for the frozen Gap 1 rates 19/300 and 20/1,500 or the Gap 2 rate 43/1,500.</w:t>
       </w:r>
     </w:p>
     <w:p>

</xml_diff>

<commit_message>
Replace Fig. 2 with the three-session web screenshot.
Use the evening-peak motorbike view (Cao Thắng to Phú Lâm) and keep the
demo congestion-proxy wording separate from Gap 1/2.

Co-authored-by: Ductam6767 <Ductam6767@users.noreply.github.com>
</commit_message>
<xml_diff>
--- a/reports/AIRPATH_AI_JIGS_IEEE_Style_English_FINAL_REVISED.docx
+++ b/reports/AIRPATH_AI_JIGS_IEEE_Style_English_FINAL_REVISED.docx
@@ -1966,7 +1966,7 @@
       <w:r>
         <w:drawing>
           <wp:inline xmlns:a="http://schemas.openxmlformats.org/drawingml/2006/main" xmlns:pic="http://schemas.openxmlformats.org/drawingml/2006/picture">
-            <wp:extent cx="2971800" cy="1931380"/>
+            <wp:extent cx="3200400" cy="1456432"/>
             <wp:docPr id="2" name="Picture 2"/>
             <wp:cNvGraphicFramePr>
               <a:graphicFrameLocks noChangeAspect="1"/>
@@ -1987,7 +1987,7 @@
                   <pic:spPr>
                     <a:xfrm>
                       <a:off x="0" y="0"/>
-                      <a:ext cx="2971800" cy="1931380"/>
+                      <a:ext cx="3200400" cy="1456432"/>
                     </a:xfrm>
                     <a:prstGeom prst="rect"/>
                   </pic:spPr>
@@ -2003,7 +2003,7 @@
         <w:pStyle w:val="IEEECaption"/>
       </w:pPr>
       <w:r>
-        <w:t>Fig. 2. AIRPATH-AI web prototype for a motorbike scenario, including the three-window demo congestion control.</w:t>
+        <w:t>Fig. 2. AIRPATH-AI web prototype (motorbike, evening-peak demo window) for Hẻm Cao Thắng · Hòa Hưng to Khu phố 11 · Phú Lâm, with the three-session time-of-day control visible in the sidebar.</w:t>
       </w:r>
     </w:p>
     <w:p>
@@ -2021,7 +2021,7 @@
         <w:ind w:firstLine="216"/>
       </w:pPr>
       <w:r>
-        <w:t>A representative interface case may show, for example, approximately 15.5 min and exposure 696–739 for the fastest motorbike route versus approximately 16.4 min and 490–514 for one alternative, depending on the selected demonstration window. These values are demonstration outputs only. They are not panel-level experimental statistics, are not direct on-road measurements, and are not evidence for Gap 1 or Gap 2.</w:t>
+        <w:t>In the screenshot of Fig. 2 (evening-peak demo window, +5 min budget), the fastest motorbike route is 15.5 min with predicted exposure 739 (µg/m³)·min, and alternative 1 is 16.4 min with 514 (µg/m³)·min (about 30% lower on the demo scale). These values are demonstration outputs only. They are not panel-level Gap 1 or Gap 2 statistics, are not on-road measurements, and must not be cited as evidence that evening peak changes the scientific selection result.</w:t>
       </w:r>
     </w:p>
     <w:p>

</xml_diff>

<commit_message>
Redraw Fig. 2 with bold in-box labels for print.
Replace the squeezed screenshot so control and route-card text stays
inside each box and fits the IEEE column width.

Co-authored-by: Ductam6767 <Ductam6767@users.noreply.github.com>
</commit_message>
<xml_diff>
--- a/reports/AIRPATH_AI_JIGS_IEEE_Style_English_FINAL_REVISED.docx
+++ b/reports/AIRPATH_AI_JIGS_IEEE_Style_English_FINAL_REVISED.docx
@@ -1966,7 +1966,7 @@
       <w:r>
         <w:drawing>
           <wp:inline xmlns:a="http://schemas.openxmlformats.org/drawingml/2006/main" xmlns:pic="http://schemas.openxmlformats.org/drawingml/2006/picture">
-            <wp:extent cx="3200400" cy="1456432"/>
+            <wp:extent cx="2971800" cy="5669280"/>
             <wp:docPr id="2" name="Picture 2"/>
             <wp:cNvGraphicFramePr>
               <a:graphicFrameLocks noChangeAspect="1"/>
@@ -1987,7 +1987,7 @@
                   <pic:spPr>
                     <a:xfrm>
                       <a:off x="0" y="0"/>
-                      <a:ext cx="3200400" cy="1456432"/>
+                      <a:ext cx="2971800" cy="5669280"/>
                     </a:xfrm>
                     <a:prstGeom prst="rect"/>
                   </pic:spPr>
@@ -2003,7 +2003,7 @@
         <w:pStyle w:val="IEEECaption"/>
       </w:pPr>
       <w:r>
-        <w:t>Fig. 2. AIRPATH-AI web prototype (motorbike, evening-peak demo window) for Hẻm Cao Thắng · Hòa Hưng to Khu phố 11 · Phú Lâm, with the three-session time-of-day control visible in the sidebar.</w:t>
+        <w:t>Fig. 2. Print view of the AIRPATH-AI web prototype (motorbike, evening-peak demo window, +5 min): Hẻm Cao Thắng · Hòa Hưng to Khu phố 11 · Phú Lâm. Bold labels are kept inside each control and route card. The three-session control is a demo congestion proxy only.</w:t>
       </w:r>
     </w:p>
     <w:p>

</xml_diff>

<commit_message>
Fix Fig. 1 box overflow and restore the real web screenshot.
Redraw only the pipeline diagram so Constrained Selection text stays
inside the box. Fig. 2 is the actual evening-peak UI again.

Co-authored-by: Ductam6767 <Ductam6767@users.noreply.github.com>
</commit_message>
<xml_diff>
--- a/reports/AIRPATH_AI_JIGS_IEEE_Style_English_FINAL_REVISED.docx
+++ b/reports/AIRPATH_AI_JIGS_IEEE_Style_English_FINAL_REVISED.docx
@@ -220,7 +220,7 @@
       <w:r>
         <w:drawing>
           <wp:inline xmlns:a="http://schemas.openxmlformats.org/drawingml/2006/main" xmlns:pic="http://schemas.openxmlformats.org/drawingml/2006/picture">
-            <wp:extent cx="2971800" cy="1621801"/>
+            <wp:extent cx="2971800" cy="1625377"/>
             <wp:docPr id="1" name="Picture 1"/>
             <wp:cNvGraphicFramePr>
               <a:graphicFrameLocks noChangeAspect="1"/>
@@ -241,7 +241,7 @@
                   <pic:spPr>
                     <a:xfrm>
                       <a:off x="0" y="0"/>
-                      <a:ext cx="2971800" cy="1621801"/>
+                      <a:ext cx="2971800" cy="1625377"/>
                     </a:xfrm>
                     <a:prstGeom prst="rect"/>
                   </pic:spPr>
@@ -1966,7 +1966,7 @@
       <w:r>
         <w:drawing>
           <wp:inline xmlns:a="http://schemas.openxmlformats.org/drawingml/2006/main" xmlns:pic="http://schemas.openxmlformats.org/drawingml/2006/picture">
-            <wp:extent cx="2971800" cy="5669280"/>
+            <wp:extent cx="2971800" cy="1352169"/>
             <wp:docPr id="2" name="Picture 2"/>
             <wp:cNvGraphicFramePr>
               <a:graphicFrameLocks noChangeAspect="1"/>
@@ -1987,7 +1987,7 @@
                   <pic:spPr>
                     <a:xfrm>
                       <a:off x="0" y="0"/>
-                      <a:ext cx="2971800" cy="5669280"/>
+                      <a:ext cx="2971800" cy="1352169"/>
                     </a:xfrm>
                     <a:prstGeom prst="rect"/>
                   </pic:spPr>
@@ -2003,7 +2003,7 @@
         <w:pStyle w:val="IEEECaption"/>
       </w:pPr>
       <w:r>
-        <w:t>Fig. 2. Print view of the AIRPATH-AI web prototype (motorbike, evening-peak demo window, +5 min): Hẻm Cao Thắng · Hòa Hưng to Khu phố 11 · Phú Lâm. Bold labels are kept inside each control and route card. The three-session control is a demo congestion proxy only.</w:t>
+        <w:t>Fig. 2. AIRPATH-AI web prototype screenshot (motorbike, evening-peak demo window) for Hẻm Cao Thắng · Hòa Hưng to Khu phố 11 · Phú Lâm. The three-session control is a demo congestion proxy only; it is not Gap 1 or Gap 2.</w:t>
       </w:r>
     </w:p>
     <w:p>

</xml_diff>

<commit_message>
Redraw Fig. 1 so pipeline labels stay inside each box.
Use a column-width vertical flowchart with bold centered text and
wrapped Constrained Selection lines.

Co-authored-by: Ductam6767 <Ductam6767@users.noreply.github.com>
</commit_message>
<xml_diff>
--- a/reports/AIRPATH_AI_JIGS_IEEE_Style_English_FINAL_REVISED.docx
+++ b/reports/AIRPATH_AI_JIGS_IEEE_Style_English_FINAL_REVISED.docx
@@ -220,7 +220,7 @@
       <w:r>
         <w:drawing>
           <wp:inline xmlns:a="http://schemas.openxmlformats.org/drawingml/2006/main" xmlns:pic="http://schemas.openxmlformats.org/drawingml/2006/picture">
-            <wp:extent cx="2971800" cy="1625377"/>
+            <wp:extent cx="2971800" cy="5989320"/>
             <wp:docPr id="1" name="Picture 1"/>
             <wp:cNvGraphicFramePr>
               <a:graphicFrameLocks noChangeAspect="1"/>
@@ -241,7 +241,7 @@
                   <pic:spPr>
                     <a:xfrm>
                       <a:off x="0" y="0"/>
-                      <a:ext cx="2971800" cy="1625377"/>
+                      <a:ext cx="2971800" cy="5989320"/>
                     </a:xfrm>
                     <a:prstGeom prst="rect"/>
                   </pic:spPr>

</xml_diff>